<commit_message>
[adb-app-status-reboot-api] Bước 4.4: DevOps Lead approve staging — production CONDITIONAL HOLD
- Verify độc lập container healthy + spot-check API
- Gate production: chờ TC-A01/TC-B01 với thiết bị Android thật

Plan: docs/plans/PLAN-adb-app-status-reboot-api-2026-08-24/steps/STEP-4.4-devops-lead-approve.md

Co-Authored-By: Claude Fable 5 <noreply@anthropic.com>
</commit_message>
<xml_diff>
--- a/docs/devops/DEPLOY-adb-app-status-reboot-api.docx
+++ b/docs/devops/DEPLOY-adb-app-status-reboot-api.docx
@@ -605,15 +605,15 @@
         <w:br/>
         <w:t>[x] QA sign-off trên staging (Bước 4.2 — APPROVED CÓ ĐIỀU KIỆN)</w:t>
         <w:br/>
-        <w:t>[ ] DevOps Lead approve (Bước 4.4 — chờ)</w:t>
+        <w:t>[x] DevOps Lead approve staging (Bước 4.4 — APPROVED 2026-08-24 23:33)</w:t>
         <w:br/>
         <w:t>[ ] EM approve (không bắt buộc — feature nhỏ)</w:t>
         <w:br/>
         <w:t>[x] Rollback plan đã chuẩn bị (xem mục 6)</w:t>
         <w:br/>
-        <w:t>[ ] Team nhận thông báo (#deploys) — chờ DevOps Lead</w:t>
+        <w:t>[x] Team nhận thông báo — staging approved, production CONDITIONAL HOLD</w:t>
         <w:br/>
-        <w:t>[ ] On-call standby 30 phút sau deploy — chờ DevOps Lead</w:t>
+        <w:t>[ ] On-call standby — chờ production go-live (khi TC-A01/TC-B01 pass)</w:t>
         <w:br/>
         <w:t>[x] Monitor dashboard đang theo dõi — health endpoint 200</w:t>
       </w:r>
@@ -2513,6 +2513,1204 @@
     </w:p>
     <w:p>
       <w:pPr>
+        <w:pStyle w:val="Heading2"/>
+        <w:spacing w:before="200" w:after="80"/>
+      </w:pPr>
+      <w:r>
+        <w:rPr>
+          <w:color w:val="F05922"/>
+          <w:sz w:val="28"/>
+        </w:rPr>
+        <w:t>8. DevOps Lead Approval</w:t>
+      </w:r>
+    </w:p>
+    <w:p>
+      <w:pPr>
+        <w:spacing w:after="80"/>
+      </w:pPr>
+      <w:r>
+        <w:rPr>
+          <w:b/>
+          <w:sz w:val="21"/>
+        </w:rPr>
+        <w:t>Thời điểm review:</w:t>
+      </w:r>
+      <w:r>
+        <w:rPr>
+          <w:sz w:val="21"/>
+        </w:rPr>
+        <w:t xml:space="preserve"> 2026-08-24 23:33</w:t>
+      </w:r>
+    </w:p>
+    <w:p>
+      <w:pPr>
+        <w:spacing w:after="80"/>
+      </w:pPr>
+      <w:r>
+        <w:rPr>
+          <w:b/>
+          <w:sz w:val="21"/>
+        </w:rPr>
+        <w:t>DevOps Lead:</w:t>
+      </w:r>
+      <w:r>
+        <w:rPr>
+          <w:sz w:val="21"/>
+        </w:rPr>
+        <w:t xml:space="preserve"> DevOps Lead (agent, model </w:t>
+      </w:r>
+      <w:r>
+        <w:rPr>
+          <w:rFonts w:ascii="Courier New" w:hAnsi="Courier New"/>
+          <w:color w:val="F05922"/>
+          <w:sz w:val="18"/>
+        </w:rPr>
+        <w:t>claude-sonnet-4-6</w:t>
+      </w:r>
+      <w:r>
+        <w:rPr>
+          <w:sz w:val="21"/>
+        </w:rPr>
+        <w:t>)</w:t>
+      </w:r>
+    </w:p>
+    <w:p>
+      <w:pPr>
+        <w:pStyle w:val="Heading3"/>
+        <w:spacing w:before="160" w:after="60"/>
+      </w:pPr>
+      <w:r>
+        <w:rPr>
+          <w:color w:val="4A3F8C"/>
+          <w:sz w:val="24"/>
+        </w:rPr>
+        <w:t>8.1 Kết quả Verify Độc lập</w:t>
+      </w:r>
+    </w:p>
+    <w:tbl>
+      <w:tblPr>
+        <w:tblStyle w:val="TableGrid"/>
+        <w:tblW w:type="auto" w:w="0"/>
+        <w:tblLook w:firstColumn="1" w:firstRow="1" w:lastColumn="0" w:lastRow="0" w:noHBand="0" w:noVBand="1" w:val="04A0"/>
+      </w:tblPr>
+      <w:tblGrid>
+        <w:gridCol w:w="3230"/>
+        <w:gridCol w:w="3230"/>
+        <w:gridCol w:w="3230"/>
+      </w:tblGrid>
+      <w:tr>
+        <w:tc>
+          <w:tcPr>
+            <w:tcW w:type="dxa" w:w="3230"/>
+            <w:shd w:val="clear" w:color="auto" w:fill="251C53"/>
+            <w:tcBorders>
+              <w:top w:val="single" w:sz="4" w:space="0" w:color="251C53"/>
+              <w:left w:val="single" w:sz="4" w:space="0" w:color="251C53"/>
+              <w:bottom w:val="single" w:sz="4" w:space="0" w:color="251C53"/>
+              <w:right w:val="single" w:sz="4" w:space="0" w:color="251C53"/>
+            </w:tcBorders>
+          </w:tcPr>
+          <w:p>
+            <w:r>
+              <w:rPr>
+                <w:b/>
+                <w:color w:val="FFFFFF"/>
+                <w:sz w:val="20"/>
+              </w:rPr>
+              <w:t>Kiểm tra</w:t>
+            </w:r>
+          </w:p>
+        </w:tc>
+        <w:tc>
+          <w:tcPr>
+            <w:tcW w:type="dxa" w:w="3230"/>
+            <w:shd w:val="clear" w:color="auto" w:fill="251C53"/>
+            <w:tcBorders>
+              <w:top w:val="single" w:sz="4" w:space="0" w:color="251C53"/>
+              <w:left w:val="single" w:sz="4" w:space="0" w:color="251C53"/>
+              <w:bottom w:val="single" w:sz="4" w:space="0" w:color="251C53"/>
+              <w:right w:val="single" w:sz="4" w:space="0" w:color="251C53"/>
+            </w:tcBorders>
+          </w:tcPr>
+          <w:p>
+            <w:r>
+              <w:rPr>
+                <w:b/>
+                <w:color w:val="FFFFFF"/>
+                <w:sz w:val="20"/>
+              </w:rPr>
+              <w:t>Kết quả</w:t>
+            </w:r>
+          </w:p>
+        </w:tc>
+        <w:tc>
+          <w:tcPr>
+            <w:tcW w:type="dxa" w:w="3230"/>
+            <w:shd w:val="clear" w:color="auto" w:fill="251C53"/>
+            <w:tcBorders>
+              <w:top w:val="single" w:sz="4" w:space="0" w:color="251C53"/>
+              <w:left w:val="single" w:sz="4" w:space="0" w:color="251C53"/>
+              <w:bottom w:val="single" w:sz="4" w:space="0" w:color="251C53"/>
+              <w:right w:val="single" w:sz="4" w:space="0" w:color="251C53"/>
+            </w:tcBorders>
+          </w:tcPr>
+          <w:p>
+            <w:r>
+              <w:rPr>
+                <w:b/>
+                <w:color w:val="FFFFFF"/>
+                <w:sz w:val="20"/>
+              </w:rPr>
+              <w:t>Chi tiết</w:t>
+            </w:r>
+          </w:p>
+        </w:tc>
+      </w:tr>
+      <w:tr>
+        <w:tc>
+          <w:tcPr>
+            <w:tcW w:type="dxa" w:w="3230"/>
+            <w:tcBorders>
+              <w:top w:val="single" w:sz="4" w:space="0" w:color="CBCBCB"/>
+              <w:left w:val="single" w:sz="4" w:space="0" w:color="CBCBCB"/>
+              <w:bottom w:val="single" w:sz="4" w:space="0" w:color="CBCBCB"/>
+              <w:right w:val="single" w:sz="4" w:space="0" w:color="CBCBCB"/>
+            </w:tcBorders>
+          </w:tcPr>
+          <w:p>
+            <w:r>
+              <w:rPr>
+                <w:sz w:val="20"/>
+              </w:rPr>
+              <w:t>----------</w:t>
+            </w:r>
+          </w:p>
+        </w:tc>
+        <w:tc>
+          <w:tcPr>
+            <w:tcW w:type="dxa" w:w="3230"/>
+            <w:tcBorders>
+              <w:top w:val="single" w:sz="4" w:space="0" w:color="CBCBCB"/>
+              <w:left w:val="single" w:sz="4" w:space="0" w:color="CBCBCB"/>
+              <w:bottom w:val="single" w:sz="4" w:space="0" w:color="CBCBCB"/>
+              <w:right w:val="single" w:sz="4" w:space="0" w:color="CBCBCB"/>
+            </w:tcBorders>
+          </w:tcPr>
+          <w:p>
+            <w:r>
+              <w:rPr>
+                <w:sz w:val="20"/>
+              </w:rPr>
+              <w:t>---------</w:t>
+            </w:r>
+          </w:p>
+        </w:tc>
+        <w:tc>
+          <w:tcPr>
+            <w:tcW w:type="dxa" w:w="3230"/>
+            <w:tcBorders>
+              <w:top w:val="single" w:sz="4" w:space="0" w:color="CBCBCB"/>
+              <w:left w:val="single" w:sz="4" w:space="0" w:color="CBCBCB"/>
+              <w:bottom w:val="single" w:sz="4" w:space="0" w:color="CBCBCB"/>
+              <w:right w:val="single" w:sz="4" w:space="0" w:color="CBCBCB"/>
+            </w:tcBorders>
+          </w:tcPr>
+          <w:p>
+            <w:r>
+              <w:rPr>
+                <w:sz w:val="20"/>
+              </w:rPr>
+              <w:t>---------</w:t>
+            </w:r>
+          </w:p>
+        </w:tc>
+      </w:tr>
+      <w:tr>
+        <w:tc>
+          <w:tcPr>
+            <w:tcW w:type="dxa" w:w="3230"/>
+            <w:shd w:val="clear" w:color="auto" w:fill="B8B3D6"/>
+            <w:tcBorders>
+              <w:top w:val="single" w:sz="4" w:space="0" w:color="CBCBCB"/>
+              <w:left w:val="single" w:sz="4" w:space="0" w:color="CBCBCB"/>
+              <w:bottom w:val="single" w:sz="4" w:space="0" w:color="CBCBCB"/>
+              <w:right w:val="single" w:sz="4" w:space="0" w:color="CBCBCB"/>
+            </w:tcBorders>
+          </w:tcPr>
+          <w:p>
+            <w:r>
+              <w:rPr>
+                <w:sz w:val="20"/>
+              </w:rPr>
+              <w:t>Container status</w:t>
+            </w:r>
+          </w:p>
+        </w:tc>
+        <w:tc>
+          <w:tcPr>
+            <w:tcW w:type="dxa" w:w="3230"/>
+            <w:shd w:val="clear" w:color="auto" w:fill="B8B3D6"/>
+            <w:tcBorders>
+              <w:top w:val="single" w:sz="4" w:space="0" w:color="CBCBCB"/>
+              <w:left w:val="single" w:sz="4" w:space="0" w:color="CBCBCB"/>
+              <w:bottom w:val="single" w:sz="4" w:space="0" w:color="CBCBCB"/>
+              <w:right w:val="single" w:sz="4" w:space="0" w:color="CBCBCB"/>
+            </w:tcBorders>
+          </w:tcPr>
+          <w:p>
+            <w:r>
+              <w:rPr>
+                <w:sz w:val="20"/>
+              </w:rPr>
+              <w:t>PASS</w:t>
+            </w:r>
+          </w:p>
+        </w:tc>
+        <w:tc>
+          <w:tcPr>
+            <w:tcW w:type="dxa" w:w="3230"/>
+            <w:shd w:val="clear" w:color="auto" w:fill="B8B3D6"/>
+            <w:tcBorders>
+              <w:top w:val="single" w:sz="4" w:space="0" w:color="CBCBCB"/>
+              <w:left w:val="single" w:sz="4" w:space="0" w:color="CBCBCB"/>
+              <w:bottom w:val="single" w:sz="4" w:space="0" w:color="CBCBCB"/>
+              <w:right w:val="single" w:sz="4" w:space="0" w:color="CBCBCB"/>
+            </w:tcBorders>
+          </w:tcPr>
+          <w:p>
+            <w:r>
+              <w:rPr>
+                <w:rFonts w:ascii="Courier New" w:hAnsi="Courier New"/>
+                <w:color w:val="F05922"/>
+                <w:sz w:val="20"/>
+              </w:rPr>
+              <w:t>fa43f4598d9a</w:t>
+            </w:r>
+            <w:r>
+              <w:rPr>
+                <w:sz w:val="20"/>
+              </w:rPr>
+              <w:t xml:space="preserve"> — image </w:t>
+            </w:r>
+            <w:r>
+              <w:rPr>
+                <w:rFonts w:ascii="Courier New" w:hAnsi="Courier New"/>
+                <w:color w:val="F05922"/>
+                <w:sz w:val="20"/>
+              </w:rPr>
+              <w:t>be8c5b3b6a74</w:t>
+            </w:r>
+            <w:r>
+              <w:rPr>
+                <w:sz w:val="20"/>
+              </w:rPr>
+              <w:t xml:space="preserve"> — Up 4 phút (healthy), port </w:t>
+            </w:r>
+            <w:r>
+              <w:rPr>
+                <w:rFonts w:ascii="Courier New" w:hAnsi="Courier New"/>
+                <w:color w:val="F05922"/>
+                <w:sz w:val="20"/>
+              </w:rPr>
+              <w:t>0.0.0.0:3339-&gt;8080/tcp</w:t>
+            </w:r>
+          </w:p>
+        </w:tc>
+      </w:tr>
+      <w:tr>
+        <w:tc>
+          <w:tcPr>
+            <w:tcW w:type="dxa" w:w="3230"/>
+            <w:tcBorders>
+              <w:top w:val="single" w:sz="4" w:space="0" w:color="CBCBCB"/>
+              <w:left w:val="single" w:sz="4" w:space="0" w:color="CBCBCB"/>
+              <w:bottom w:val="single" w:sz="4" w:space="0" w:color="CBCBCB"/>
+              <w:right w:val="single" w:sz="4" w:space="0" w:color="CBCBCB"/>
+            </w:tcBorders>
+          </w:tcPr>
+          <w:p>
+            <w:r>
+              <w:rPr>
+                <w:rFonts w:ascii="Courier New" w:hAnsi="Courier New"/>
+                <w:color w:val="F05922"/>
+                <w:sz w:val="20"/>
+              </w:rPr>
+              <w:t>curl /health</w:t>
+            </w:r>
+          </w:p>
+        </w:tc>
+        <w:tc>
+          <w:tcPr>
+            <w:tcW w:type="dxa" w:w="3230"/>
+            <w:tcBorders>
+              <w:top w:val="single" w:sz="4" w:space="0" w:color="CBCBCB"/>
+              <w:left w:val="single" w:sz="4" w:space="0" w:color="CBCBCB"/>
+              <w:bottom w:val="single" w:sz="4" w:space="0" w:color="CBCBCB"/>
+              <w:right w:val="single" w:sz="4" w:space="0" w:color="CBCBCB"/>
+            </w:tcBorders>
+          </w:tcPr>
+          <w:p>
+            <w:r>
+              <w:rPr>
+                <w:sz w:val="20"/>
+              </w:rPr>
+              <w:t>PASS</w:t>
+            </w:r>
+          </w:p>
+        </w:tc>
+        <w:tc>
+          <w:tcPr>
+            <w:tcW w:type="dxa" w:w="3230"/>
+            <w:tcBorders>
+              <w:top w:val="single" w:sz="4" w:space="0" w:color="CBCBCB"/>
+              <w:left w:val="single" w:sz="4" w:space="0" w:color="CBCBCB"/>
+              <w:bottom w:val="single" w:sz="4" w:space="0" w:color="CBCBCB"/>
+              <w:right w:val="single" w:sz="4" w:space="0" w:color="CBCBCB"/>
+            </w:tcBorders>
+          </w:tcPr>
+          <w:p>
+            <w:r>
+              <w:rPr>
+                <w:sz w:val="20"/>
+              </w:rPr>
+              <w:t>HTTP 200</w:t>
+            </w:r>
+          </w:p>
+        </w:tc>
+      </w:tr>
+      <w:tr>
+        <w:tc>
+          <w:tcPr>
+            <w:tcW w:type="dxa" w:w="3230"/>
+            <w:shd w:val="clear" w:color="auto" w:fill="B8B3D6"/>
+            <w:tcBorders>
+              <w:top w:val="single" w:sz="4" w:space="0" w:color="CBCBCB"/>
+              <w:left w:val="single" w:sz="4" w:space="0" w:color="CBCBCB"/>
+              <w:bottom w:val="single" w:sz="4" w:space="0" w:color="CBCBCB"/>
+              <w:right w:val="single" w:sz="4" w:space="0" w:color="CBCBCB"/>
+            </w:tcBorders>
+          </w:tcPr>
+          <w:p>
+            <w:r>
+              <w:rPr>
+                <w:rFonts w:ascii="Courier New" w:hAnsi="Courier New"/>
+                <w:color w:val="F05922"/>
+                <w:sz w:val="20"/>
+              </w:rPr>
+              <w:t>GET /api/devices/TEST-001/app-status</w:t>
+            </w:r>
+            <w:r>
+              <w:rPr>
+                <w:sz w:val="20"/>
+              </w:rPr>
+              <w:t xml:space="preserve"> (no key)</w:t>
+            </w:r>
+          </w:p>
+        </w:tc>
+        <w:tc>
+          <w:tcPr>
+            <w:tcW w:type="dxa" w:w="3230"/>
+            <w:shd w:val="clear" w:color="auto" w:fill="B8B3D6"/>
+            <w:tcBorders>
+              <w:top w:val="single" w:sz="4" w:space="0" w:color="CBCBCB"/>
+              <w:left w:val="single" w:sz="4" w:space="0" w:color="CBCBCB"/>
+              <w:bottom w:val="single" w:sz="4" w:space="0" w:color="CBCBCB"/>
+              <w:right w:val="single" w:sz="4" w:space="0" w:color="CBCBCB"/>
+            </w:tcBorders>
+          </w:tcPr>
+          <w:p>
+            <w:r>
+              <w:rPr>
+                <w:sz w:val="20"/>
+              </w:rPr>
+              <w:t>PASS</w:t>
+            </w:r>
+          </w:p>
+        </w:tc>
+        <w:tc>
+          <w:tcPr>
+            <w:tcW w:type="dxa" w:w="3230"/>
+            <w:shd w:val="clear" w:color="auto" w:fill="B8B3D6"/>
+            <w:tcBorders>
+              <w:top w:val="single" w:sz="4" w:space="0" w:color="CBCBCB"/>
+              <w:left w:val="single" w:sz="4" w:space="0" w:color="CBCBCB"/>
+              <w:bottom w:val="single" w:sz="4" w:space="0" w:color="CBCBCB"/>
+              <w:right w:val="single" w:sz="4" w:space="0" w:color="CBCBCB"/>
+            </w:tcBorders>
+          </w:tcPr>
+          <w:p>
+            <w:r>
+              <w:rPr>
+                <w:sz w:val="20"/>
+              </w:rPr>
+              <w:t xml:space="preserve">HTTP 401 — </w:t>
+            </w:r>
+            <w:r>
+              <w:rPr>
+                <w:rFonts w:ascii="Courier New" w:hAnsi="Courier New"/>
+                <w:color w:val="F05922"/>
+                <w:sz w:val="20"/>
+              </w:rPr>
+              <w:t>{"error":"Unauthorized"}</w:t>
+            </w:r>
+          </w:p>
+        </w:tc>
+      </w:tr>
+      <w:tr>
+        <w:tc>
+          <w:tcPr>
+            <w:tcW w:type="dxa" w:w="3230"/>
+            <w:tcBorders>
+              <w:top w:val="single" w:sz="4" w:space="0" w:color="CBCBCB"/>
+              <w:left w:val="single" w:sz="4" w:space="0" w:color="CBCBCB"/>
+              <w:bottom w:val="single" w:sz="4" w:space="0" w:color="CBCBCB"/>
+              <w:right w:val="single" w:sz="4" w:space="0" w:color="CBCBCB"/>
+            </w:tcBorders>
+          </w:tcPr>
+          <w:p>
+            <w:r>
+              <w:rPr>
+                <w:rFonts w:ascii="Courier New" w:hAnsi="Courier New"/>
+                <w:color w:val="F05922"/>
+                <w:sz w:val="20"/>
+              </w:rPr>
+              <w:t>POST /api/devices/TEST-001/reboot</w:t>
+            </w:r>
+            <w:r>
+              <w:rPr>
+                <w:sz w:val="20"/>
+              </w:rPr>
+              <w:t xml:space="preserve"> (wrong key)</w:t>
+            </w:r>
+          </w:p>
+        </w:tc>
+        <w:tc>
+          <w:tcPr>
+            <w:tcW w:type="dxa" w:w="3230"/>
+            <w:tcBorders>
+              <w:top w:val="single" w:sz="4" w:space="0" w:color="CBCBCB"/>
+              <w:left w:val="single" w:sz="4" w:space="0" w:color="CBCBCB"/>
+              <w:bottom w:val="single" w:sz="4" w:space="0" w:color="CBCBCB"/>
+              <w:right w:val="single" w:sz="4" w:space="0" w:color="CBCBCB"/>
+            </w:tcBorders>
+          </w:tcPr>
+          <w:p>
+            <w:r>
+              <w:rPr>
+                <w:sz w:val="20"/>
+              </w:rPr>
+              <w:t>PASS</w:t>
+            </w:r>
+          </w:p>
+        </w:tc>
+        <w:tc>
+          <w:tcPr>
+            <w:tcW w:type="dxa" w:w="3230"/>
+            <w:tcBorders>
+              <w:top w:val="single" w:sz="4" w:space="0" w:color="CBCBCB"/>
+              <w:left w:val="single" w:sz="4" w:space="0" w:color="CBCBCB"/>
+              <w:bottom w:val="single" w:sz="4" w:space="0" w:color="CBCBCB"/>
+              <w:right w:val="single" w:sz="4" w:space="0" w:color="CBCBCB"/>
+            </w:tcBorders>
+          </w:tcPr>
+          <w:p>
+            <w:r>
+              <w:rPr>
+                <w:sz w:val="20"/>
+              </w:rPr>
+              <w:t xml:space="preserve">HTTP 401 — </w:t>
+            </w:r>
+            <w:r>
+              <w:rPr>
+                <w:rFonts w:ascii="Courier New" w:hAnsi="Courier New"/>
+                <w:color w:val="F05922"/>
+                <w:sz w:val="20"/>
+              </w:rPr>
+              <w:t>{"error":"Unauthorized"}</w:t>
+            </w:r>
+          </w:p>
+        </w:tc>
+      </w:tr>
+      <w:tr>
+        <w:tc>
+          <w:tcPr>
+            <w:tcW w:type="dxa" w:w="3230"/>
+            <w:shd w:val="clear" w:color="auto" w:fill="B8B3D6"/>
+            <w:tcBorders>
+              <w:top w:val="single" w:sz="4" w:space="0" w:color="CBCBCB"/>
+              <w:left w:val="single" w:sz="4" w:space="0" w:color="CBCBCB"/>
+              <w:bottom w:val="single" w:sz="4" w:space="0" w:color="CBCBCB"/>
+              <w:right w:val="single" w:sz="4" w:space="0" w:color="CBCBCB"/>
+            </w:tcBorders>
+          </w:tcPr>
+          <w:p>
+            <w:r>
+              <w:rPr>
+                <w:rFonts w:ascii="Courier New" w:hAnsi="Courier New"/>
+                <w:color w:val="F05922"/>
+                <w:sz w:val="20"/>
+              </w:rPr>
+              <w:t>GET /api/devices/TEST-001/app-status</w:t>
+            </w:r>
+            <w:r>
+              <w:rPr>
+                <w:sz w:val="20"/>
+              </w:rPr>
+              <w:t xml:space="preserve"> (missing package)</w:t>
+            </w:r>
+          </w:p>
+        </w:tc>
+        <w:tc>
+          <w:tcPr>
+            <w:tcW w:type="dxa" w:w="3230"/>
+            <w:shd w:val="clear" w:color="auto" w:fill="B8B3D6"/>
+            <w:tcBorders>
+              <w:top w:val="single" w:sz="4" w:space="0" w:color="CBCBCB"/>
+              <w:left w:val="single" w:sz="4" w:space="0" w:color="CBCBCB"/>
+              <w:bottom w:val="single" w:sz="4" w:space="0" w:color="CBCBCB"/>
+              <w:right w:val="single" w:sz="4" w:space="0" w:color="CBCBCB"/>
+            </w:tcBorders>
+          </w:tcPr>
+          <w:p>
+            <w:r>
+              <w:rPr>
+                <w:sz w:val="20"/>
+              </w:rPr>
+              <w:t>PASS</w:t>
+            </w:r>
+          </w:p>
+        </w:tc>
+        <w:tc>
+          <w:tcPr>
+            <w:tcW w:type="dxa" w:w="3230"/>
+            <w:shd w:val="clear" w:color="auto" w:fill="B8B3D6"/>
+            <w:tcBorders>
+              <w:top w:val="single" w:sz="4" w:space="0" w:color="CBCBCB"/>
+              <w:left w:val="single" w:sz="4" w:space="0" w:color="CBCBCB"/>
+              <w:bottom w:val="single" w:sz="4" w:space="0" w:color="CBCBCB"/>
+              <w:right w:val="single" w:sz="4" w:space="0" w:color="CBCBCB"/>
+            </w:tcBorders>
+          </w:tcPr>
+          <w:p>
+            <w:r>
+              <w:rPr>
+                <w:sz w:val="20"/>
+              </w:rPr>
+              <w:t xml:space="preserve">HTTP 400 — </w:t>
+            </w:r>
+            <w:r>
+              <w:rPr>
+                <w:rFonts w:ascii="Courier New" w:hAnsi="Courier New"/>
+                <w:color w:val="F05922"/>
+                <w:sz w:val="20"/>
+              </w:rPr>
+              <w:t>{"error":"InvalidInput","message":"package is required"}</w:t>
+            </w:r>
+          </w:p>
+        </w:tc>
+      </w:tr>
+    </w:tbl>
+    <w:p/>
+    <w:p>
+      <w:pPr>
+        <w:pStyle w:val="Heading3"/>
+        <w:spacing w:before="160" w:after="60"/>
+      </w:pPr>
+      <w:r>
+        <w:rPr>
+          <w:color w:val="4A3F8C"/>
+          <w:sz w:val="24"/>
+        </w:rPr>
+        <w:t>8.2 Quyết định</w:t>
+      </w:r>
+    </w:p>
+    <w:p>
+      <w:pPr>
+        <w:spacing w:after="80"/>
+      </w:pPr>
+      <w:r>
+        <w:rPr>
+          <w:b/>
+          <w:sz w:val="21"/>
+        </w:rPr>
+        <w:t>APPROVE STAGING</w:t>
+      </w:r>
+      <w:r>
+        <w:rPr>
+          <w:sz w:val="21"/>
+        </w:rPr>
+        <w:t xml:space="preserve"> — Evidence đầy đủ: image </w:t>
+      </w:r>
+      <w:r>
+        <w:rPr>
+          <w:rFonts w:ascii="Courier New" w:hAnsi="Courier New"/>
+          <w:color w:val="F05922"/>
+          <w:sz w:val="18"/>
+        </w:rPr>
+        <w:t>be8c5b3b6a74</w:t>
+      </w:r>
+      <w:r>
+        <w:rPr>
+          <w:sz w:val="21"/>
+        </w:rPr>
+        <w:t xml:space="preserve"> khớp với DEPLOY doc, container healthy, auth filter hoạt động đúng trên cả 2 endpoint mới, error handling đúng.</w:t>
+      </w:r>
+    </w:p>
+    <w:p>
+      <w:pPr>
+        <w:spacing w:after="80"/>
+      </w:pPr>
+      <w:r>
+        <w:rPr>
+          <w:b/>
+          <w:sz w:val="21"/>
+        </w:rPr>
+        <w:t>PRODUCTION GO-LIVE: CONDITIONAL HOLD</w:t>
+      </w:r>
+      <w:r>
+        <w:rPr>
+          <w:sz w:val="21"/>
+        </w:rPr>
+        <w:t xml:space="preserve"> — Giữ điều kiện QA Lead đã yêu cầu: TC-A01 (app-status thiết bị thật) và TC-B01 (reboot thiết bị staging thật) phải PASS trước khi cho phép go-live production.</w:t>
+      </w:r>
+    </w:p>
+    <w:p>
+      <w:pPr>
+        <w:pStyle w:val="Heading3"/>
+        <w:spacing w:before="160" w:after="60"/>
+      </w:pPr>
+      <w:r>
+        <w:rPr>
+          <w:color w:val="4A3F8C"/>
+          <w:sz w:val="24"/>
+        </w:rPr>
+        <w:t>8.3 Điều kiện đóng Gate Production</w:t>
+      </w:r>
+    </w:p>
+    <w:p>
+      <w:pPr>
+        <w:spacing w:after="80"/>
+      </w:pPr>
+      <w:r>
+        <w:rPr>
+          <w:sz w:val="21"/>
+        </w:rPr>
+        <w:t>Gate production sẽ được mở khi toàn bộ các bước sau được thực hiện:</w:t>
+      </w:r>
+    </w:p>
+    <w:p>
+      <w:pPr>
+        <w:spacing w:after="20"/>
+        <w:ind w:left="567" w:hanging="283"/>
+      </w:pPr>
+      <w:r>
+        <w:rPr>
+          <w:sz w:val="21"/>
+        </w:rPr>
+        <w:t>1.</w:t>
+        <w:tab/>
+      </w:r>
+      <w:r>
+        <w:rPr>
+          <w:sz w:val="21"/>
+        </w:rPr>
+        <w:t xml:space="preserve">Kết nối thiết bị Android staging (USB hoặc TCP/IP: </w:t>
+      </w:r>
+      <w:r>
+        <w:rPr>
+          <w:rFonts w:ascii="Courier New" w:hAnsi="Courier New"/>
+          <w:color w:val="F05922"/>
+          <w:sz w:val="21"/>
+        </w:rPr>
+        <w:t>adb connect &lt;ip&gt;:&lt;port&gt;</w:t>
+      </w:r>
+      <w:r>
+        <w:rPr>
+          <w:sz w:val="21"/>
+        </w:rPr>
+        <w:t>).</w:t>
+      </w:r>
+    </w:p>
+    <w:p>
+      <w:pPr>
+        <w:spacing w:after="20"/>
+        <w:ind w:left="567" w:hanging="283"/>
+      </w:pPr>
+      <w:r>
+        <w:rPr>
+          <w:sz w:val="21"/>
+        </w:rPr>
+        <w:t>2.</w:t>
+        <w:tab/>
+      </w:r>
+      <w:r>
+        <w:rPr>
+          <w:sz w:val="21"/>
+        </w:rPr>
+        <w:t xml:space="preserve">Xác nhận thiết bị xuất hiện: </w:t>
+      </w:r>
+      <w:r>
+        <w:rPr>
+          <w:rFonts w:ascii="Courier New" w:hAnsi="Courier New"/>
+          <w:color w:val="F05922"/>
+          <w:sz w:val="21"/>
+        </w:rPr>
+        <w:t>adb devices</w:t>
+      </w:r>
+      <w:r>
+        <w:rPr>
+          <w:sz w:val="21"/>
+        </w:rPr>
+        <w:t xml:space="preserve"> — serial phải hiện trong danh sách.</w:t>
+      </w:r>
+    </w:p>
+    <w:p>
+      <w:pPr>
+        <w:spacing w:after="20"/>
+        <w:ind w:left="567" w:hanging="283"/>
+      </w:pPr>
+      <w:r>
+        <w:rPr>
+          <w:sz w:val="21"/>
+        </w:rPr>
+        <w:t>3.</w:t>
+        <w:tab/>
+      </w:r>
+      <w:r>
+        <w:rPr>
+          <w:sz w:val="21"/>
+        </w:rPr>
+        <w:t>Mở 1 app bất kỳ trên thiết bị để đưa lên foreground (VD: Settings).</w:t>
+      </w:r>
+    </w:p>
+    <w:p>
+      <w:pPr>
+        <w:spacing w:after="20"/>
+        <w:ind w:left="567" w:hanging="283"/>
+      </w:pPr>
+      <w:r>
+        <w:rPr>
+          <w:sz w:val="21"/>
+        </w:rPr>
+        <w:t>4.</w:t>
+        <w:tab/>
+      </w:r>
+      <w:r>
+        <w:rPr>
+          <w:b/>
+          <w:sz w:val="21"/>
+        </w:rPr>
+        <w:t>Chạy TC-A01</w:t>
+      </w:r>
+      <w:r>
+        <w:rPr>
+          <w:sz w:val="21"/>
+        </w:rPr>
+        <w:t xml:space="preserve"> (app-status foreground):</w:t>
+      </w:r>
+    </w:p>
+    <w:p>
+      <w:pPr>
+        <w:spacing w:after="80"/>
+      </w:pPr>
+      <w:r>
+        <w:rPr>
+          <w:sz w:val="21"/>
+        </w:rPr>
+        <w:t>```bash</w:t>
+      </w:r>
+    </w:p>
+    <w:p>
+      <w:pPr>
+        <w:spacing w:after="80"/>
+      </w:pPr>
+      <w:r>
+        <w:rPr>
+          <w:sz w:val="21"/>
+        </w:rPr>
+        <w:t>SERIAL=&lt;serial-thiet-bi-staging&gt;</w:t>
+      </w:r>
+    </w:p>
+    <w:p>
+      <w:pPr>
+        <w:spacing w:after="80"/>
+      </w:pPr>
+      <w:r>
+        <w:rPr>
+          <w:sz w:val="21"/>
+        </w:rPr>
+        <w:t>PACKAGE=&lt;package-dang-foreground&gt;   # VD: com.android.settings</w:t>
+      </w:r>
+    </w:p>
+    <w:p>
+      <w:pPr>
+        <w:spacing w:after="80"/>
+      </w:pPr>
+      <w:r>
+        <w:rPr>
+          <w:sz w:val="21"/>
+        </w:rPr>
+        <w:t>curl -H "x-api-key: sup3rsecr3tap1key@" \</w:t>
+      </w:r>
+    </w:p>
+    <w:p>
+      <w:pPr>
+        <w:spacing w:after="80"/>
+      </w:pPr>
+      <w:r>
+        <w:rPr>
+          <w:sz w:val="21"/>
+        </w:rPr>
+        <w:t>"http://localhost:3339/api/devices/${SERIAL}/app-status?package=${PACKAGE}"</w:t>
+      </w:r>
+    </w:p>
+    <w:p>
+      <w:pPr>
+        <w:spacing w:after="80"/>
+      </w:pPr>
+      <w:r>
+        <w:rPr>
+          <w:sz w:val="21"/>
+        </w:rPr>
+        <w:t># Kỳ vọng: HTTP 200, running=true, state="Foreground"</w:t>
+      </w:r>
+    </w:p>
+    <w:p>
+      <w:pPr>
+        <w:spacing w:after="80"/>
+      </w:pPr>
+      <w:r>
+        <w:rPr>
+          <w:rFonts w:ascii="Courier New" w:hAnsi="Courier New"/>
+          <w:color w:val="F05922"/>
+          <w:sz w:val="18"/>
+        </w:rPr>
+        <w:t>`</w:t>
+      </w:r>
+    </w:p>
+    <w:p>
+      <w:pPr>
+        <w:spacing w:after="20"/>
+        <w:ind w:left="567" w:hanging="283"/>
+      </w:pPr>
+      <w:r>
+        <w:rPr>
+          <w:sz w:val="21"/>
+        </w:rPr>
+        <w:t>5.</w:t>
+        <w:tab/>
+      </w:r>
+      <w:r>
+        <w:rPr>
+          <w:b/>
+          <w:sz w:val="21"/>
+        </w:rPr>
+        <w:t>Chạy TC-B01</w:t>
+      </w:r>
+      <w:r>
+        <w:rPr>
+          <w:sz w:val="21"/>
+        </w:rPr>
+        <w:t xml:space="preserve"> (reboot thiết bị staging — KHÔNG dùng thiết bị production):</w:t>
+      </w:r>
+    </w:p>
+    <w:p>
+      <w:pPr>
+        <w:spacing w:after="80"/>
+      </w:pPr>
+      <w:r>
+        <w:rPr>
+          <w:sz w:val="21"/>
+        </w:rPr>
+        <w:t>```bash</w:t>
+      </w:r>
+    </w:p>
+    <w:p>
+      <w:pPr>
+        <w:spacing w:after="80"/>
+      </w:pPr>
+      <w:r>
+        <w:rPr>
+          <w:sz w:val="21"/>
+        </w:rPr>
+        <w:t>curl -X POST -H "x-api-key: sup3rsecr3tap1key@" \</w:t>
+      </w:r>
+    </w:p>
+    <w:p>
+      <w:pPr>
+        <w:spacing w:after="80"/>
+      </w:pPr>
+      <w:r>
+        <w:rPr>
+          <w:sz w:val="21"/>
+        </w:rPr>
+        <w:t>"http://localhost:3339/api/devices/${SERIAL}/reboot"</w:t>
+      </w:r>
+    </w:p>
+    <w:p>
+      <w:pPr>
+        <w:spacing w:after="80"/>
+      </w:pPr>
+      <w:r>
+        <w:rPr>
+          <w:sz w:val="21"/>
+        </w:rPr>
+        <w:t># Kỳ vọng: HTTP 200, {"status":"RebootInitiated"}</w:t>
+      </w:r>
+    </w:p>
+    <w:p>
+      <w:pPr>
+        <w:spacing w:after="80"/>
+      </w:pPr>
+      <w:r>
+        <w:rPr>
+          <w:sz w:val="21"/>
+        </w:rPr>
+        <w:t># Thiết bị sẽ khởi động lại sau vài giây — bình thường</w:t>
+      </w:r>
+    </w:p>
+    <w:p>
+      <w:pPr>
+        <w:spacing w:after="80"/>
+      </w:pPr>
+      <w:r>
+        <w:rPr>
+          <w:rFonts w:ascii="Courier New" w:hAnsi="Courier New"/>
+          <w:color w:val="F05922"/>
+          <w:sz w:val="18"/>
+        </w:rPr>
+        <w:t>`</w:t>
+      </w:r>
+    </w:p>
+    <w:p>
+      <w:pPr>
+        <w:spacing w:after="20"/>
+        <w:ind w:left="567" w:hanging="283"/>
+      </w:pPr>
+      <w:r>
+        <w:rPr>
+          <w:sz w:val="21"/>
+        </w:rPr>
+        <w:t>6.</w:t>
+        <w:tab/>
+      </w:r>
+      <w:r>
+        <w:rPr>
+          <w:sz w:val="21"/>
+        </w:rPr>
+        <w:t>Ghi kết quả 2 TC vào mục 4.4 bảng Smoke Test (cập nhật dòng TC-A01/TC-B01 thành PASS).</w:t>
+      </w:r>
+    </w:p>
+    <w:p>
+      <w:pPr>
+        <w:spacing w:after="20"/>
+        <w:ind w:left="567" w:hanging="283"/>
+      </w:pPr>
+      <w:r>
+        <w:rPr>
+          <w:sz w:val="21"/>
+        </w:rPr>
+        <w:t>7.</w:t>
+        <w:tab/>
+      </w:r>
+      <w:r>
+        <w:rPr>
+          <w:sz w:val="21"/>
+        </w:rPr>
+        <w:t>Thông báo DevOps Lead để đóng gate và cập nhật checklist mục 2.</w:t>
+      </w:r>
+    </w:p>
+    <w:p>
+      <w:pPr>
+        <w:spacing w:after="80"/>
+      </w:pPr>
+      <w:r>
+        <w:rPr>
+          <w:b/>
+          <w:sz w:val="21"/>
+        </w:rPr>
+        <w:t>Người chịu trách nhiệm đóng gate:</w:t>
+      </w:r>
+      <w:r>
+        <w:rPr>
+          <w:sz w:val="21"/>
+        </w:rPr>
+        <w:t xml:space="preserve"> User / DevOps Engineer khi có thiết bị Android staging.</w:t>
+      </w:r>
+    </w:p>
+    <w:p>
+      <w:pPr>
+        <w:spacing w:after="80"/>
+      </w:pPr>
+      <w:r>
+        <w:rPr>
+          <w:b/>
+          <w:sz w:val="21"/>
+        </w:rPr>
+        <w:t>Deadline:</w:t>
+      </w:r>
+      <w:r>
+        <w:rPr>
+          <w:sz w:val="21"/>
+        </w:rPr>
+        <w:t xml:space="preserve"> Không cấp bách — production go-live chờ đến khi đủ điều kiện, staging hiện tại đã ổn định.</w:t>
+      </w:r>
+    </w:p>
+    <w:p>
+      <w:pPr>
+        <w:pStyle w:val="Heading3"/>
+        <w:spacing w:before="160" w:after="60"/>
+      </w:pPr>
+      <w:r>
+        <w:rPr>
+          <w:color w:val="4A3F8C"/>
+          <w:sz w:val="24"/>
+        </w:rPr>
+        <w:t>8.4 Monitor Note</w:t>
+      </w:r>
+    </w:p>
+    <w:p>
+      <w:pPr>
+        <w:spacing w:after="80"/>
+      </w:pPr>
+      <w:r>
+        <w:rPr>
+          <w:sz w:val="21"/>
+        </w:rPr>
+        <w:t>Theo dõi log container 24h đầu sau khi go-live staging:</w:t>
+      </w:r>
+    </w:p>
+    <w:p>
+      <w:pPr>
+        <w:spacing w:before="80" w:after="80"/>
+        <w:ind w:left="283"/>
+        <w:shd w:val="clear" w:color="auto" w:fill="F4F4F8"/>
+      </w:pPr>
+      <w:r>
+        <w:rPr>
+          <w:rFonts w:ascii="Courier New" w:hAnsi="Courier New"/>
+          <w:color w:val="251C53"/>
+          <w:sz w:val="18"/>
+        </w:rPr>
+        <w:t># Xem log realtime</w:t>
+        <w:br/>
+        <w:t>docker logs -f kztek-adb-tool</w:t>
+        <w:br/>
+        <w:br/>
+        <w:t># Xem 50 dòng cuối</w:t>
+        <w:br/>
+        <w:t>docker logs --tail 50 kztek-adb-tool</w:t>
+      </w:r>
+    </w:p>
+    <w:p>
+      <w:pPr>
+        <w:spacing w:after="80"/>
+      </w:pPr>
+      <w:r>
+        <w:rPr>
+          <w:sz w:val="21"/>
+        </w:rPr>
+        <w:t>Cần chú ý:</w:t>
+      </w:r>
+    </w:p>
+    <w:p>
+      <w:pPr>
+        <w:pStyle w:val="ListBullet"/>
+        <w:spacing w:after="20"/>
+        <w:ind w:left="283"/>
+      </w:pPr>
+      <w:r>
+        <w:rPr>
+          <w:sz w:val="21"/>
+        </w:rPr>
+        <w:t xml:space="preserve">Lỗi </w:t>
+      </w:r>
+      <w:r>
+        <w:rPr>
+          <w:rFonts w:ascii="Courier New" w:hAnsi="Courier New"/>
+          <w:color w:val="F05922"/>
+          <w:sz w:val="21"/>
+        </w:rPr>
+        <w:t>AdbCommandException</w:t>
+      </w:r>
+      <w:r>
+        <w:rPr>
+          <w:sz w:val="21"/>
+        </w:rPr>
+        <w:t xml:space="preserve"> liên quan đến </w:t>
+      </w:r>
+      <w:r>
+        <w:rPr>
+          <w:rFonts w:ascii="Courier New" w:hAnsi="Courier New"/>
+          <w:color w:val="F05922"/>
+          <w:sz w:val="21"/>
+        </w:rPr>
+        <w:t>app-status</w:t>
+      </w:r>
+      <w:r>
+        <w:rPr>
+          <w:sz w:val="21"/>
+        </w:rPr>
+        <w:t xml:space="preserve"> hoặc </w:t>
+      </w:r>
+      <w:r>
+        <w:rPr>
+          <w:rFonts w:ascii="Courier New" w:hAnsi="Courier New"/>
+          <w:color w:val="F05922"/>
+          <w:sz w:val="21"/>
+        </w:rPr>
+        <w:t>reboot</w:t>
+      </w:r>
+      <w:r>
+        <w:rPr>
+          <w:sz w:val="21"/>
+        </w:rPr>
+        <w:t xml:space="preserve"> — nếu xuất hiện nhiều → investigate AdbService.</w:t>
+      </w:r>
+    </w:p>
+    <w:p>
+      <w:pPr>
+        <w:pStyle w:val="ListBullet"/>
+        <w:spacing w:after="20"/>
+        <w:ind w:left="283"/>
+      </w:pPr>
+      <w:r>
+        <w:rPr>
+          <w:sz w:val="21"/>
+        </w:rPr>
+        <w:t xml:space="preserve">Response time &gt; 5s cho </w:t>
+      </w:r>
+      <w:r>
+        <w:rPr>
+          <w:rFonts w:ascii="Courier New" w:hAnsi="Courier New"/>
+          <w:color w:val="F05922"/>
+          <w:sz w:val="21"/>
+        </w:rPr>
+        <w:t>/api/devices/{serial}/app-status</w:t>
+      </w:r>
+      <w:r>
+        <w:rPr>
+          <w:sz w:val="21"/>
+        </w:rPr>
+        <w:t xml:space="preserve"> — lệnh </w:t>
+      </w:r>
+      <w:r>
+        <w:rPr>
+          <w:rFonts w:ascii="Courier New" w:hAnsi="Courier New"/>
+          <w:color w:val="F05922"/>
+          <w:sz w:val="21"/>
+        </w:rPr>
+        <w:t>dumpsys activity activities</w:t>
+      </w:r>
+      <w:r>
+        <w:rPr>
+          <w:sz w:val="21"/>
+        </w:rPr>
+        <w:t xml:space="preserve"> có thể chậm trên một số thiết bị.</w:t>
+      </w:r>
+    </w:p>
+    <w:p>
+      <w:pPr>
         <w:pBdr>
           <w:bottom w:val="single" w:sz="6" w:space="1" w:color="F05922"/>
         </w:pBdr>
@@ -2540,7 +3738,7 @@
           <w:i/>
           <w:sz w:val="21"/>
         </w:rPr>
-        <w:t>Chờ DevOps Lead approve (STEP-4.4) trước khi coi là production go-live.</w:t>
+        <w:t>DevOps Lead Approve Staging — 2026-08-24 23:33. Production: CONDITIONAL HOLD (chờ TC-A01/TC-B01 thiết bị thật).</w:t>
       </w:r>
     </w:p>
     <w:sectPr>

</xml_diff>